<commit_message>
docs: replace methodology doc, add data README, fix dashboard wording
- Replace CAPE_Data_Sources_Methodology.docx with corrected version
- Add data/data_README.md explaining the three data layers and citation rules
- Fix dashboard caption: "predict" → "model and illustrate … simulated"
</commit_message>
<xml_diff>
--- a/data/CAPE_Data_Sources_Methodology.docx
+++ b/data/CAPE_Data_Sources_Methodology.docx
@@ -76,6 +76,74 @@
           <w:szCs w:val="22"/>
         </w:rPr>
         <w:t xml:space="preserve">This document explains where every figure in the three CAPE data files originates, what was sourced directly from public records versus calculated using a documented methodology, and how each column connects back to its source. It is intended to give reviewers a clear and honest accounting of data provenance.</w:t>
+      </w:r>
+    </w:p>
+    <w:p>
+      <w:pPr>
+        <w:pStyle w:val="Heading1"/>
+      </w:pPr>
+      <w:r>
+        <w:t>How to Read This Document: Two Data Layers</w:t>
+      </w:r>
+    </w:p>
+    <w:p>
+      <w:r>
+        <w:rPr>
+          <w:rFonts w:ascii="Arial" w:hAnsi="Arial"/>
+          <w:b w:val="0"/>
+        </w:rPr>
+        <w:t>CAPE draws on two separate datasets that play different roles. Keeping them distinct is essential to reading every figure in this document correctly.</w:t>
+      </w:r>
+    </w:p>
+    <w:p>
+      <w:r>
+        <w:rPr>
+          <w:rFonts w:ascii="Arial" w:hAnsi="Arial"/>
+          <w:b/>
+        </w:rPr>
+        <w:t xml:space="preserve">ERPsim layer (the mechanism).  </w:t>
+      </w:r>
+      <w:r>
+        <w:rPr>
+          <w:rFonts w:ascii="Arial" w:hAnsi="Arial"/>
+          <w:b w:val="0"/>
+        </w:rPr>
+        <w:t>The carbon-aware decision mechanism — how inventory overstock and order risk translate into CO2e — is demonstrated on SAP ERPsim simulation tables (Sales, Carbon Emissions, Inventory, and others). That is where the working analysis lives, because it is the only dataset linking orders, inventory, and emissions together. ERPsim is SAP’s own simulation environment.</w:t>
+      </w:r>
+    </w:p>
+    <w:p>
+      <w:r>
+        <w:rPr>
+          <w:rFonts w:ascii="Arial" w:hAnsi="Arial"/>
+          <w:b/>
+        </w:rPr>
+        <w:t xml:space="preserve">LAX layer (this document).  </w:t>
+      </w:r>
+      <w:r>
+        <w:rPr>
+          <w:rFonts w:ascii="Arial" w:hAnsi="Arial"/>
+          <w:b w:val="0"/>
+        </w:rPr>
+        <w:t>The files documented here — Sales.xlsx, Prices.xlsx, and Carbon Emissions.xlsx — are a LAX-grounded modeled overlay. They combine real LAX cargo tonnage and standard published emission factors with representative fields. Their role is real-world motivation and volume context, not measured carbon outcomes.</w:t>
+      </w:r>
+    </w:p>
+    <w:p>
+      <w:pPr>
+        <w:shd w:val="clear" w:fill="EAF2FA"/>
+      </w:pPr>
+      <w:r>
+        <w:rPr>
+          <w:rFonts w:ascii="Arial" w:hAnsi="Arial"/>
+          <w:b/>
+        </w:rPr>
+        <w:t xml:space="preserve">What this means for the figures below:  </w:t>
+      </w:r>
+      <w:r>
+        <w:rPr>
+          <w:rFonts w:ascii="Arial" w:hAnsi="Arial"/>
+          <w:b w:val="0"/>
+        </w:rPr>
+        <w:t>The tonnage, distances, and price-index values are real or standard. The delivery-status and overstock-penalty fields are representative and illustrate the concept rather than measure it. Because overstock carbon here is derived from an assigned delivery status, this layer demonstrates the CAPE logic; it does not prove a statistical relationship. The ERPsim layer carries the empirical weight; the LAX figures in this document are illustrative and grounded in real volumes.</w:t>
       </w:r>
     </w:p>
     <w:p>
@@ -1090,6 +1158,25 @@
       </w:pPr>
       <w:r>
         <w:t xml:space="preserve">Overstock_CO2e_kg applies an additional carbon penalty only to Late or At-Risk shipments (3.5% and 1.5% of shipment weight respectively), reflecting the extra emissions from re-routing and warehousing delay — this is the core CAPE thesis variable connecting late orders to carbon cost.</w:t>
+      </w:r>
+    </w:p>
+    <w:p>
+      <w:pPr>
+        <w:shd w:val="clear" w:fill="EAF2FA"/>
+      </w:pPr>
+      <w:r>
+        <w:rPr>
+          <w:rFonts w:ascii="Arial" w:hAnsi="Arial"/>
+          <w:b/>
+        </w:rPr>
+        <w:t xml:space="preserve">Important note on overstock and delivery status:  </w:t>
+      </w:r>
+      <w:r>
+        <w:rPr>
+          <w:rFonts w:ascii="Arial" w:hAnsi="Arial"/>
+          <w:b w:val="0"/>
+        </w:rPr>
+        <w:t>Because Overstock_CO2e_kg is applied as a fixed penalty to shipments whose Delivery_Status was assigned rather than measured, the link between lateness and overstock carbon in this file is true by construction. Treat these overstock figures as an illustration of the CAPE mechanism, not as evidence that late orders statistically drive carbon. The empirical demonstration of overstock as a carbon source uses the ERPsim Carbon Emissions table, where overstock emissions are generated independently by the simulation.</w:t>
       </w:r>
     </w:p>
     <w:p>

</xml_diff>